<commit_message>
added ga4 support for tracking visits
</commit_message>
<xml_diff>
--- a/resumes/zachary-cortinovis-resume.docx
+++ b/resumes/zachary-cortinovis-resume.docx
@@ -47,7 +47,16 @@
           <w:sz w:val="28"/>
           <w:szCs w:val="28"/>
         </w:rPr>
-        <w:t xml:space="preserve">Graphics &amp; User Experience </w:t>
+        <w:t xml:space="preserve">Graphics &amp; </w:t>
+      </w:r>
+      <w:r>
+        <w:rPr>
+          <w:rFonts w:ascii="Helvetica" w:hAnsi="Helvetica"/>
+          <w:color w:val="4F81BD" w:themeColor="accent1"/>
+          <w:sz w:val="28"/>
+          <w:szCs w:val="28"/>
+        </w:rPr>
+        <w:t xml:space="preserve">UX </w:t>
       </w:r>
       <w:r>
         <w:rPr>
@@ -256,27 +265,7 @@
             <w:szCs w:val="20"/>
             <w:u w:val="single"/>
           </w:rPr>
-          <w:t>zacharycor</w:t>
-        </w:r>
-        <w:r>
-          <w:rPr>
-            <w:rFonts w:ascii="Helvetica" w:hAnsi="Helvetica"/>
-            <w:color w:val="1155CC"/>
-            <w:sz w:val="20"/>
-            <w:szCs w:val="20"/>
-            <w:u w:val="single"/>
-          </w:rPr>
-          <w:t>t</w:t>
-        </w:r>
-        <w:r>
-          <w:rPr>
-            <w:rFonts w:ascii="Helvetica" w:hAnsi="Helvetica"/>
-            <w:color w:val="1155CC"/>
-            <w:sz w:val="20"/>
-            <w:szCs w:val="20"/>
-            <w:u w:val="single"/>
-          </w:rPr>
-          <w:t>inovis.com</w:t>
+          <w:t>zacharycortinovis.com</w:t>
         </w:r>
       </w:hyperlink>
     </w:p>
@@ -579,66 +568,6 @@
           <w:color w:val="4F81BD" w:themeColor="accent1"/>
         </w:rPr>
         <w:t xml:space="preserve">Product Manager </w:t>
-      </w:r>
-      <w:r>
-        <w:rPr>
-          <w:rFonts w:ascii="Helvetica" w:eastAsia="Arial Unicode MS" w:hAnsi="Helvetica" w:cs="Arial Unicode MS"/>
-          <w:b/>
-          <w:bCs/>
-          <w:color w:val="95B3D7" w:themeColor="accent1" w:themeTint="99"/>
-        </w:rPr>
-        <w:sym w:font="Symbol" w:char="F0AC"/>
-      </w:r>
-      <w:r>
-        <w:rPr>
-          <w:rFonts w:ascii="Helvetica" w:eastAsia="Arial Unicode MS" w:hAnsi="Helvetica" w:cs="Arial Unicode MS"/>
-          <w:b/>
-          <w:bCs/>
-          <w:color w:val="B8CCE4" w:themeColor="accent1" w:themeTint="66"/>
-        </w:rPr>
-        <w:t xml:space="preserve"> </w:t>
-      </w:r>
-      <w:r>
-        <w:rPr>
-          <w:rFonts w:ascii="Helvetica" w:hAnsi="Helvetica"/>
-          <w:color w:val="95B3D7" w:themeColor="accent1" w:themeTint="99"/>
-        </w:rPr>
-        <w:t>Project Manager</w:t>
-      </w:r>
-      <w:r>
-        <w:rPr>
-          <w:rFonts w:ascii="Helvetica" w:eastAsia="Roboto" w:hAnsi="Helvetica" w:cs="Roboto"/>
-          <w:b/>
-          <w:bCs/>
-          <w:color w:val="95B3D7" w:themeColor="accent1" w:themeTint="99"/>
-        </w:rPr>
-        <w:t xml:space="preserve"> </w:t>
-      </w:r>
-      <w:r>
-        <w:rPr>
-          <w:rFonts w:ascii="Helvetica" w:eastAsia="Arial Unicode MS" w:hAnsi="Helvetica" w:cs="Arial Unicode MS"/>
-          <w:b/>
-          <w:bCs/>
-          <w:color w:val="B8CCE4" w:themeColor="accent1" w:themeTint="66"/>
-        </w:rPr>
-        <w:sym w:font="Symbol" w:char="F0AC"/>
-      </w:r>
-      <w:r>
-        <w:rPr>
-          <w:rFonts w:ascii="Helvetica" w:eastAsia="Arial Unicode MS" w:hAnsi="Helvetica" w:cs="Arial Unicode MS"/>
-          <w:b/>
-          <w:bCs/>
-          <w:color w:val="B8CCE4" w:themeColor="accent1" w:themeTint="66"/>
-        </w:rPr>
-        <w:t xml:space="preserve"> </w:t>
-      </w:r>
-      <w:r>
-        <w:rPr>
-          <w:rFonts w:ascii="Helvetica" w:eastAsia="Roboto" w:hAnsi="Helvetica" w:cs="Roboto"/>
-          <w:color w:val="B8CCE4" w:themeColor="accent1" w:themeTint="66"/>
-          <w:highlight w:val="white"/>
-        </w:rPr>
-        <w:t>Technology and Product Development Intern</w:t>
       </w:r>
     </w:p>
     <w:p>
@@ -1611,7 +1540,7 @@
           <w:sz w:val="18"/>
           <w:szCs w:val="18"/>
         </w:rPr>
-        <w:t xml:space="preserve">Web Design, </w:t>
+        <w:t xml:space="preserve">UGC, </w:t>
       </w:r>
       <w:r>
         <w:rPr>
@@ -1619,7 +1548,7 @@
           <w:sz w:val="18"/>
           <w:szCs w:val="18"/>
         </w:rPr>
-        <w:t xml:space="preserve">UX for Conversion, </w:t>
+        <w:t xml:space="preserve">Web Design, </w:t>
       </w:r>
       <w:r>
         <w:rPr>
@@ -1627,7 +1556,7 @@
           <w:sz w:val="18"/>
           <w:szCs w:val="18"/>
         </w:rPr>
-        <w:t>Ad Design,</w:t>
+        <w:t xml:space="preserve">UX for Conversion, </w:t>
       </w:r>
       <w:r>
         <w:rPr>
@@ -1635,7 +1564,31 @@
           <w:sz w:val="18"/>
           <w:szCs w:val="18"/>
         </w:rPr>
-        <w:t xml:space="preserve"> Reprioritization, Figma Design Systems</w:t>
+        <w:t>Ad Design,</w:t>
+      </w:r>
+      <w:r>
+        <w:rPr>
+          <w:rFonts w:ascii="Helvetica" w:hAnsi="Helvetica"/>
+          <w:sz w:val="18"/>
+          <w:szCs w:val="18"/>
+        </w:rPr>
+        <w:t xml:space="preserve"> Reprioritization, </w:t>
+      </w:r>
+      <w:r>
+        <w:rPr>
+          <w:rFonts w:ascii="Helvetica" w:hAnsi="Helvetica"/>
+          <w:sz w:val="18"/>
+          <w:szCs w:val="18"/>
+        </w:rPr>
+        <w:t xml:space="preserve">AI Design, </w:t>
+      </w:r>
+      <w:r>
+        <w:rPr>
+          <w:rFonts w:ascii="Helvetica" w:hAnsi="Helvetica"/>
+          <w:sz w:val="18"/>
+          <w:szCs w:val="18"/>
+        </w:rPr>
+        <w:t>Design Systems</w:t>
       </w:r>
       <w:r>
         <w:rPr>

</xml_diff>